<commit_message>
Syllabus: wording for the room (page, Word, PDF)
</commit_message>
<xml_diff>
--- a/syllabus/FI355-International-Finance-Syllabus-Maaitah.docx
+++ b/syllabus/FI355-International-Finance-Syllabus-Maaitah.docx
@@ -14,7 +14,7 @@
           <w:sz w:val="18"/>
           <w:szCs w:val="18"/>
         </w:rPr>
-        <w:t xml:space="preserve">PROPOSED SYLLABUS  ·  IES ABROAD LONDON  ·  SPRING 2027</w:t>
+        <w:t xml:space="preserve">SYLLABUS  ·  IES ABROAD LONDON  ·  SPRING 2027</w:t>
       </w:r>
     </w:p>
     <w:p>
@@ -805,7 +805,7 @@
           <w:sz w:val="18"/>
           <w:szCs w:val="18"/>
         </w:rPr>
-        <w:t xml:space="preserve">Prepared by Dr Ahmad Maaitah for the IES Abroad London lecturer interview, October 2026. This is a proposal, not an official IES Abroad publication; course facts (credits, contact hours, assessment weights) follow the IES Abroad FI 355 course specification.</w:t>
+        <w:t xml:space="preserve">Prepared by Dr Ahmad Maaitah, October 2026. Not an official IES Abroad publication; course facts (credits, contact hours, assessment weights) follow the IES Abroad FI 355 course specification.</w:t>
       </w:r>
     </w:p>
     <w:p>
@@ -6775,7 +6775,7 @@
         <w:sz w:val="16"/>
         <w:szCs w:val="16"/>
       </w:rPr>
-      <w:t xml:space="preserve">FI 355 International Finance  ·  proposed syllabus  ·  IES Abroad London, Spring 2027  ·  Dr Ahmad Maaitah</w:t>
+      <w:t xml:space="preserve">FI 355 International Finance  ·  syllabus  ·  IES Abroad London, Spring 2027  ·  Dr Ahmad Maaitah</w:t>
     </w:r>
   </w:p>
 </w:hdr>

</xml_diff>

<commit_message>
Syllabus: remove subtitle, instructor rows and the prepared-by note
</commit_message>
<xml_diff>
--- a/syllabus/FI355-International-Finance-Syllabus-Maaitah.docx
+++ b/syllabus/FI355-International-Finance-Syllabus-Maaitah.docx
@@ -35,17 +35,8 @@
     </w:p>
     <w:p>
       <w:pPr>
-        <w:spacing w:after="200"/>
-      </w:pPr>
-      <w:r>
-        <w:rPr>
-          <w:rFonts w:ascii="Calibri" w:cs="Calibri" w:eastAsia="Calibri" w:hAnsi="Calibri"/>
-          <w:color w:val="4C5873"/>
-          <w:sz w:val="24"/>
-          <w:szCs w:val="24"/>
-        </w:rPr>
-        <w:t xml:space="preserve">A course where the room is doing, not just listening</w:t>
-      </w:r>
+        <w:spacing w:after="160"/>
+      </w:pPr>
     </w:p>
     <w:tbl>
       <w:tblPr>
@@ -607,7 +598,7 @@
                 <w:sz w:val="19"/>
                 <w:szCs w:val="19"/>
               </w:rPr>
-              <w:t xml:space="preserve">Instructor</w:t>
+              <w:t xml:space="preserve">Course site</w:t>
             </w:r>
           </w:p>
         </w:tc>
@@ -642,172 +633,12 @@
                 <w:sz w:val="19"/>
                 <w:szCs w:val="19"/>
               </w:rPr>
-              <w:t xml:space="preserve">Dr Ahmad Maaitah</w:t>
-            </w:r>
-          </w:p>
-        </w:tc>
-      </w:tr>
-      <w:tr>
-        <w:tc>
-          <w:tcPr>
-            <w:tcW w:type="dxa" w:w="2400"/>
-            <w:tcBorders>
-              <w:top w:val="single" w:color="CFD6E5" w:sz="4"/>
-              <w:left w:val="single" w:color="CFD6E5" w:sz="4"/>
-              <w:bottom w:val="single" w:color="CFD6E5" w:sz="4"/>
-              <w:right w:val="single" w:color="CFD6E5" w:sz="4"/>
-            </w:tcBorders>
-            <w:shd w:fill="E9EDF6" w:color="auto" w:val="clear"/>
-            <w:tcMar>
-              <w:top w:type="dxa" w:w="60"/>
-              <w:left w:type="dxa" w:w="100"/>
-              <w:bottom w:type="dxa" w:w="60"/>
-              <w:right w:type="dxa" w:w="100"/>
-            </w:tcMar>
-            <w:vAlign w:val="top"/>
-          </w:tcPr>
-          <w:p>
-            <w:pPr>
-              <w:spacing w:after="40" w:line="260"/>
-              <w:jc w:val="left"/>
-            </w:pPr>
-            <w:r>
-              <w:rPr>
-                <w:rFonts w:ascii="Calibri" w:cs="Calibri" w:eastAsia="Calibri" w:hAnsi="Calibri"/>
-                <w:b w:val="false"/>
-                <w:bCs w:val="false"/>
-                <w:color w:val="4C5873"/>
-                <w:sz w:val="19"/>
-                <w:szCs w:val="19"/>
-              </w:rPr>
-              <w:t xml:space="preserve">Office hours</w:t>
-            </w:r>
-          </w:p>
-        </w:tc>
-        <w:tc>
-          <w:tcPr>
-            <w:tcW w:type="dxa" w:w="6960"/>
-            <w:tcBorders>
-              <w:top w:val="single" w:color="CFD6E5" w:sz="4"/>
-              <w:left w:val="single" w:color="CFD6E5" w:sz="4"/>
-              <w:bottom w:val="single" w:color="CFD6E5" w:sz="4"/>
-              <w:right w:val="single" w:color="CFD6E5" w:sz="4"/>
-            </w:tcBorders>
-            <w:tcMar>
-              <w:top w:type="dxa" w:w="60"/>
-              <w:left w:type="dxa" w:w="100"/>
-              <w:bottom w:type="dxa" w:w="60"/>
-              <w:right w:type="dxa" w:w="100"/>
-            </w:tcMar>
-            <w:vAlign w:val="top"/>
-          </w:tcPr>
-          <w:p>
-            <w:pPr>
-              <w:spacing w:after="40" w:line="260"/>
-              <w:jc w:val="left"/>
-            </w:pPr>
-            <w:r>
-              <w:rPr>
-                <w:rFonts w:ascii="Calibri" w:cs="Calibri" w:eastAsia="Calibri" w:hAnsi="Calibri"/>
-                <w:b w:val="false"/>
-                <w:bCs w:val="false"/>
-                <w:color w:val="15192B"/>
-                <w:sz w:val="19"/>
-                <w:szCs w:val="19"/>
-              </w:rPr>
-              <w:t xml:space="preserve">Twice weekly at the Centre (times set with the timetable) and by appointment</w:t>
-            </w:r>
-          </w:p>
-        </w:tc>
-      </w:tr>
-      <w:tr>
-        <w:tc>
-          <w:tcPr>
-            <w:tcW w:type="dxa" w:w="2400"/>
-            <w:tcBorders>
-              <w:top w:val="single" w:color="CFD6E5" w:sz="4"/>
-              <w:left w:val="single" w:color="CFD6E5" w:sz="4"/>
-              <w:bottom w:val="single" w:color="CFD6E5" w:sz="4"/>
-              <w:right w:val="single" w:color="CFD6E5" w:sz="4"/>
-            </w:tcBorders>
-            <w:shd w:fill="E9EDF6" w:color="auto" w:val="clear"/>
-            <w:tcMar>
-              <w:top w:type="dxa" w:w="60"/>
-              <w:left w:type="dxa" w:w="100"/>
-              <w:bottom w:type="dxa" w:w="60"/>
-              <w:right w:type="dxa" w:w="100"/>
-            </w:tcMar>
-            <w:vAlign w:val="top"/>
-          </w:tcPr>
-          <w:p>
-            <w:pPr>
-              <w:spacing w:after="40" w:line="260"/>
-              <w:jc w:val="left"/>
-            </w:pPr>
-            <w:r>
-              <w:rPr>
-                <w:rFonts w:ascii="Calibri" w:cs="Calibri" w:eastAsia="Calibri" w:hAnsi="Calibri"/>
-                <w:b w:val="false"/>
-                <w:bCs w:val="false"/>
-                <w:color w:val="4C5873"/>
-                <w:sz w:val="19"/>
-                <w:szCs w:val="19"/>
-              </w:rPr>
-              <w:t xml:space="preserve">Course site</w:t>
-            </w:r>
-          </w:p>
-        </w:tc>
-        <w:tc>
-          <w:tcPr>
-            <w:tcW w:type="dxa" w:w="6960"/>
-            <w:tcBorders>
-              <w:top w:val="single" w:color="CFD6E5" w:sz="4"/>
-              <w:left w:val="single" w:color="CFD6E5" w:sz="4"/>
-              <w:bottom w:val="single" w:color="CFD6E5" w:sz="4"/>
-              <w:right w:val="single" w:color="CFD6E5" w:sz="4"/>
-            </w:tcBorders>
-            <w:tcMar>
-              <w:top w:type="dxa" w:w="60"/>
-              <w:left w:type="dxa" w:w="100"/>
-              <w:bottom w:type="dxa" w:w="60"/>
-              <w:right w:type="dxa" w:w="100"/>
-            </w:tcMar>
-            <w:vAlign w:val="top"/>
-          </w:tcPr>
-          <w:p>
-            <w:pPr>
-              <w:spacing w:after="40" w:line="260"/>
-              <w:jc w:val="left"/>
-            </w:pPr>
-            <w:r>
-              <w:rPr>
-                <w:rFonts w:ascii="Calibri" w:cs="Calibri" w:eastAsia="Calibri" w:hAnsi="Calibri"/>
-                <w:b w:val="false"/>
-                <w:bCs w:val="false"/>
-                <w:color w:val="15192B"/>
-                <w:sz w:val="19"/>
-                <w:szCs w:val="19"/>
-              </w:rPr>
               <w:t xml:space="preserve">Moodle (readings, warm-ups, problem sets, gradebook) and the open course site with the interactive simulations</w:t>
             </w:r>
           </w:p>
         </w:tc>
       </w:tr>
     </w:tbl>
-    <w:p>
-      <w:pPr>
-        <w:spacing w:after="120"/>
-      </w:pPr>
-      <w:r>
-        <w:rPr>
-          <w:rFonts w:ascii="Calibri" w:cs="Calibri" w:eastAsia="Calibri" w:hAnsi="Calibri"/>
-          <w:color w:val="4C5873"/>
-          <w:sz w:val="18"/>
-          <w:szCs w:val="18"/>
-        </w:rPr>
-        <w:t xml:space="preserve">Prepared by Dr Ahmad Maaitah, October 2026. Not an official IES Abroad publication; course facts (credits, contact hours, assessment weights) follow the IES Abroad FI 355 course specification.</w:t>
-      </w:r>
-    </w:p>
     <w:p>
       <w:pPr>
         <w:pStyle w:val="Heading1"/>

</xml_diff>